<commit_message>
ISO W10: gerbang rujukan USULAN + adjudikasi 41 jalur; LEG-REG-03, LEG-RPT-02 lolos r2; LEG-REG-04, LEG-RPT-01 residu
- Gerbang baru build: rujukan ke butir ber-(USULAN) yang diganti fakta tanpa label ditolak
  (kontrol positif reports/w10/usulref_gate_test.txt).
- 12 dokumen yang sudah lolos diadjudikasi: 28 label (USULAN) dibawa ke fakta pengganti,
  13 dicatat alasannya di notes (instruksi mekanis, definisi, bagian butir yang bukan USULAN).
  Semua dirender ulang dan lolos gerbang mesin.
- LEG-REG-03 dan LEG-RPT-02 lolos pemeriksa buta putaran 2.
- LEG-REG-04 dan LEG-RPT-01 gagal kedua, dikembalikan ke bed1bb6 (residu).

Co-Authored-By: Claude Opus 5.5 <noreply@anthropic.com>
Claude-Session: https://claude.ai/code/session_01BhkCQM7h3krZb9kjY2Nate
</commit_message>
<xml_diff>
--- a/out/04_Legal/SNX-LEG-FRM-03 Data Protection & Confidentiality Compliance Review (Rev00 DRAFT).docx
+++ b/out/04_Legal/SNX-LEG-FRM-03 Data Protection & Confidentiality Compliance Review (Rev00 DRAFT).docx
@@ -6815,7 +6815,7 @@
                 <w:sz w:val="24"/>
                 <w:szCs w:val="24"/>
               </w:rPr>
-              <w:t>Menyampaikan keterangan kegiatan pengelolaan data di unitnya dan menjalankan tindakan atas temuan yang ditetapkan untuk jabatannya.</w:t>
+              <w:t>Menyampaikan keterangan kegiatan pengelolaan data di unitnya dan menjalankan tindakan atas temuan yang ditetapkan untuk jabatannya (USULAN).</w:t>
             </w:r>
           </w:p>
         </w:tc>
@@ -16439,7 +16439,7 @@
                 <w:sz w:val="24"/>
                 <w:szCs w:val="24"/>
               </w:rPr>
-              <w:t>Folder Google Drive Departemen Legal. Pemilik: Line Manager Legal, sesuai SNX-LEG-SOP-03. Klasifikasi paling rendah RESTRICTED (Internal).</w:t>
+              <w:t>Folder Google Drive Departemen Legal. Pemilik: Line Manager Legal, sesuai SNX-LEG-SOP-03. Klasifikasi paling rendah RESTRICTED (Internal) (USULAN).</w:t>
             </w:r>
           </w:p>
         </w:tc>

</xml_diff>